<commit_message>
feat: Actualización final de la plantilla Word de Hoja de Vida
</commit_message>
<xml_diff>
--- a/src/features/fundacion/docs/FORMATO HOJA DE VIDA FHISYL.docx
+++ b/src/features/fundacion/docs/FORMATO HOJA DE VIDA FHISYL.docx
@@ -156,7 +156,7 @@
           <w:lang w:val="es-CO" w:eastAsia="es-CO"/>
         </w:rPr>
         <w:drawing>
-          <wp:anchor distT="0" distB="0" distL="114300" distR="114300" simplePos="0" relativeHeight="251692544" behindDoc="1" locked="0" layoutInCell="1" allowOverlap="1" wp14:anchorId="0E1B33CF" wp14:editId="3F2E20EA">
+          <wp:anchor distT="0" distB="0" distL="114300" distR="114300" simplePos="0" relativeHeight="251692544" behindDoc="1" locked="0" layoutInCell="1" allowOverlap="1" wp14:anchorId="0E1B33CF" wp14:editId="3085C15B">
             <wp:simplePos x="0" y="0"/>
             <wp:positionH relativeFrom="column">
               <wp:posOffset>4093845</wp:posOffset>
@@ -493,8 +493,39 @@
                 <w:noProof/>
                 <w:sz w:val="26"/>
                 <w:szCs w:val="26"/>
-              </w:rPr>
-            </w:pPr>
+                <w:lang w:val="es-AR"/>
+              </w:rPr>
+            </w:pPr>
+            <w:r>
+              <w:rPr>
+                <w:rFonts w:ascii="Trebuchet MS" w:hAnsi="Trebuchet MS" w:cs="Arial"/>
+                <w:noProof/>
+                <w:sz w:val="26"/>
+                <w:szCs w:val="26"/>
+                <w:lang w:val="es-AR"/>
+              </w:rPr>
+              <w:t>{</w:t>
+            </w:r>
+            <w:r>
+              <w:rPr>
+                <w:rFonts w:ascii="Trebuchet MS" w:hAnsi="Trebuchet MS" w:cs="Arial"/>
+                <w:noProof/>
+                <w:sz w:val="26"/>
+                <w:szCs w:val="26"/>
+                <w:lang w:val="es-AR"/>
+              </w:rPr>
+              <w:t>documento_num</w:t>
+            </w:r>
+            <w:r>
+              <w:rPr>
+                <w:rFonts w:ascii="Trebuchet MS" w:hAnsi="Trebuchet MS" w:cs="Arial"/>
+                <w:noProof/>
+                <w:sz w:val="26"/>
+                <w:szCs w:val="26"/>
+                <w:lang w:val="es-AR"/>
+              </w:rPr>
+              <w:t>}</w:t>
+            </w:r>
           </w:p>
         </w:tc>
       </w:tr>
@@ -570,6 +601,15 @@
                 <w:szCs w:val="26"/>
               </w:rPr>
             </w:pPr>
+            <w:r>
+              <w:rPr>
+                <w:rFonts w:ascii="Trebuchet MS" w:hAnsi="Trebuchet MS" w:cs="Arial"/>
+                <w:noProof/>
+                <w:sz w:val="26"/>
+                <w:szCs w:val="26"/>
+              </w:rPr>
+              <w:t>{}</w:t>
+            </w:r>
           </w:p>
         </w:tc>
       </w:tr>
@@ -625,8 +665,37 @@
                 <w:noProof/>
                 <w:sz w:val="26"/>
                 <w:szCs w:val="26"/>
-              </w:rPr>
-            </w:pPr>
+                <w:lang w:val="es-AR"/>
+              </w:rPr>
+            </w:pPr>
+            <w:r>
+              <w:rPr>
+                <w:rFonts w:ascii="Trebuchet MS" w:hAnsi="Trebuchet MS" w:cs="Arial"/>
+                <w:noProof/>
+                <w:sz w:val="26"/>
+                <w:szCs w:val="26"/>
+              </w:rPr>
+              <w:t>{</w:t>
+            </w:r>
+            <w:r>
+              <w:rPr>
+                <w:rFonts w:ascii="Trebuchet MS" w:hAnsi="Trebuchet MS" w:cs="Arial"/>
+                <w:noProof/>
+                <w:sz w:val="26"/>
+                <w:szCs w:val="26"/>
+                <w:lang w:val="es-AR"/>
+              </w:rPr>
+              <w:t>fecha_nacimiento</w:t>
+            </w:r>
+            <w:r>
+              <w:rPr>
+                <w:rFonts w:ascii="Trebuchet MS" w:hAnsi="Trebuchet MS" w:cs="Arial"/>
+                <w:noProof/>
+                <w:sz w:val="26"/>
+                <w:szCs w:val="26"/>
+              </w:rPr>
+              <w:t>}</w:t>
+            </w:r>
           </w:p>
         </w:tc>
       </w:tr>
@@ -1058,8 +1127,38 @@
                 <w:noProof/>
                 <w:sz w:val="26"/>
                 <w:szCs w:val="26"/>
-              </w:rPr>
-            </w:pPr>
+                <w:lang w:val="es-AR"/>
+              </w:rPr>
+            </w:pPr>
+            <w:r>
+              <w:rPr>
+                <w:rFonts w:ascii="Trebuchet MS" w:hAnsi="Trebuchet MS" w:cs="Arial"/>
+                <w:noProof/>
+                <w:sz w:val="26"/>
+                <w:szCs w:val="26"/>
+              </w:rPr>
+              <w:t>{</w:t>
+            </w:r>
+            <w:r>
+              <w:rPr>
+                <w:rFonts w:ascii="Trebuchet MS" w:hAnsi="Trebuchet MS" w:cs="Arial"/>
+                <w:noProof/>
+                <w:sz w:val="26"/>
+                <w:szCs w:val="26"/>
+                <w:lang w:val="es-AR"/>
+              </w:rPr>
+              <w:t>direccion</w:t>
+            </w:r>
+            <w:r>
+              <w:rPr>
+                <w:rFonts w:ascii="Trebuchet MS" w:hAnsi="Trebuchet MS" w:cs="Arial"/>
+                <w:noProof/>
+                <w:sz w:val="26"/>
+                <w:szCs w:val="26"/>
+                <w:lang w:val="es-AR"/>
+              </w:rPr>
+              <w:t>}</w:t>
+            </w:r>
           </w:p>
         </w:tc>
       </w:tr>
@@ -1117,8 +1216,38 @@
                 <w:noProof/>
                 <w:sz w:val="26"/>
                 <w:szCs w:val="26"/>
-              </w:rPr>
-            </w:pPr>
+                <w:lang w:val="es-AR"/>
+              </w:rPr>
+            </w:pPr>
+            <w:r>
+              <w:rPr>
+                <w:rFonts w:ascii="Trebuchet MS" w:hAnsi="Trebuchet MS" w:cs="Arial"/>
+                <w:noProof/>
+                <w:sz w:val="26"/>
+                <w:szCs w:val="26"/>
+              </w:rPr>
+              <w:t>{</w:t>
+            </w:r>
+            <w:r>
+              <w:rPr>
+                <w:rFonts w:ascii="Trebuchet MS" w:hAnsi="Trebuchet MS" w:cs="Arial"/>
+                <w:noProof/>
+                <w:sz w:val="26"/>
+                <w:szCs w:val="26"/>
+                <w:lang w:val="es-AR"/>
+              </w:rPr>
+              <w:t>telefono</w:t>
+            </w:r>
+            <w:r>
+              <w:rPr>
+                <w:rFonts w:ascii="Trebuchet MS" w:hAnsi="Trebuchet MS" w:cs="Arial"/>
+                <w:noProof/>
+                <w:sz w:val="26"/>
+                <w:szCs w:val="26"/>
+                <w:lang w:val="es-AR"/>
+              </w:rPr>
+              <w:t>}</w:t>
+            </w:r>
           </w:p>
         </w:tc>
       </w:tr>
@@ -1175,8 +1304,37 @@
                 <w:noProof/>
                 <w:sz w:val="26"/>
                 <w:szCs w:val="26"/>
-              </w:rPr>
-            </w:pPr>
+                <w:lang w:val="es-AR"/>
+              </w:rPr>
+            </w:pPr>
+            <w:r>
+              <w:rPr>
+                <w:rFonts w:ascii="Trebuchet MS" w:hAnsi="Trebuchet MS" w:cs="Arial"/>
+                <w:noProof/>
+                <w:sz w:val="26"/>
+                <w:szCs w:val="26"/>
+              </w:rPr>
+              <w:t>{</w:t>
+            </w:r>
+            <w:r>
+              <w:rPr>
+                <w:rFonts w:ascii="Trebuchet MS" w:hAnsi="Trebuchet MS" w:cs="Arial"/>
+                <w:noProof/>
+                <w:sz w:val="26"/>
+                <w:szCs w:val="26"/>
+                <w:lang w:val="es-AR"/>
+              </w:rPr>
+              <w:t>email</w:t>
+            </w:r>
+            <w:r>
+              <w:rPr>
+                <w:rFonts w:ascii="Trebuchet MS" w:hAnsi="Trebuchet MS" w:cs="Arial"/>
+                <w:noProof/>
+                <w:sz w:val="26"/>
+                <w:szCs w:val="26"/>
+              </w:rPr>
+              <w:t>}</w:t>
+            </w:r>
           </w:p>
         </w:tc>
       </w:tr>
@@ -9876,7 +10034,7 @@
                       <a:effectLst/>
                       <a:extLst>
                         <a:ext uri="{C572A759-6A51-4108-AA02-DFA0A04FC94B}">
-                          <ma14:wrappingTextBoxFlag xmlns:arto="http://schemas.microsoft.com/office/word/2006/arto" xmlns="" xmlns:mo="http://schemas.microsoft.com/office/mac/office/2008/main" xmlns:mv="urn:schemas-microsoft-com:mac:vml" xmlns:o="urn:schemas-microsoft-com:office:office" xmlns:v="urn:schemas-microsoft-com:vml" xmlns:w10="urn:schemas-microsoft-com:office:word" xmlns:w="http://schemas.openxmlformats.org/wordprocessingml/2006/main" xmlns:ma14="http://schemas.microsoft.com/office/mac/drawingml/2011/main"/>
+                          <ma14:wrappingTextBoxFlag xmlns:ma14="http://schemas.microsoft.com/office/mac/drawingml/2011/main" xmlns:w="http://schemas.openxmlformats.org/wordprocessingml/2006/main" xmlns:w10="urn:schemas-microsoft-com:office:word" xmlns:v="urn:schemas-microsoft-com:vml" xmlns:o="urn:schemas-microsoft-com:office:office" xmlns:mv="urn:schemas-microsoft-com:mac:vml" xmlns:mo="http://schemas.microsoft.com/office/mac/office/2008/main" xmlns="" xmlns:arto="http://schemas.microsoft.com/office/word/2006/arto"/>
                         </a:ext>
                       </a:extLst>
                     </wps:spPr>

</xml_diff>

<commit_message>
fix: inclusión de FormularioHojaDeVida.jsx y ajustes finales de Hoja de Vida
</commit_message>
<xml_diff>
--- a/src/features/fundacion/docs/FORMATO HOJA DE VIDA FHISYL.docx
+++ b/src/features/fundacion/docs/FORMATO HOJA DE VIDA FHISYL.docx
@@ -2,6 +2,7 @@
 <file path=word/document.xml><?xml version="1.0" encoding="utf-8"?>
 <w:document xmlns:wpc="http://schemas.microsoft.com/office/word/2010/wordprocessingCanvas" xmlns:cx="http://schemas.microsoft.com/office/drawing/2014/chartex" xmlns:cx1="http://schemas.microsoft.com/office/drawing/2015/9/8/chartex" xmlns:cx2="http://schemas.microsoft.com/office/drawing/2015/10/21/chartex" xmlns:cx3="http://schemas.microsoft.com/office/drawing/2016/5/9/chartex" xmlns:cx4="http://schemas.microsoft.com/office/drawing/2016/5/10/chartex" xmlns:cx5="http://schemas.microsoft.com/office/drawing/2016/5/11/chartex" xmlns:cx6="http://schemas.microsoft.com/office/drawing/2016/5/12/chartex" xmlns:cx7="http://schemas.microsoft.com/office/drawing/2016/5/13/chartex" xmlns:cx8="http://schemas.microsoft.com/office/drawing/2016/5/14/chartex" xmlns:mc="http://schemas.openxmlformats.org/markup-compatibility/2006" xmlns:aink="http://schemas.microsoft.com/office/drawing/2016/ink" xmlns:am3d="http://schemas.microsoft.com/office/drawing/2017/model3d" xmlns:o="urn:schemas-microsoft-com:office:office" xmlns:oel="http://schemas.microsoft.com/office/2019/extlst" xmlns:r="http://schemas.openxmlformats.org/officeDocument/2006/relationships" xmlns:m="http://schemas.openxmlformats.org/officeDocument/2006/math" xmlns:v="urn:schemas-microsoft-com:vml" xmlns:wp14="http://schemas.microsoft.com/office/word/2010/wordprocessingDrawing" xmlns:wp="http://schemas.openxmlformats.org/drawingml/2006/wordprocessingDrawing" xmlns:w10="urn:schemas-microsoft-com:office:word" xmlns:w="http://schemas.openxmlformats.org/wordprocessingml/2006/main" xmlns:w14="http://schemas.microsoft.com/office/word/2010/wordml" xmlns:w15="http://schemas.microsoft.com/office/word/2012/wordml" xmlns:w16cex="http://schemas.microsoft.com/office/word/2018/wordml/cex" xmlns:w16cid="http://schemas.microsoft.com/office/word/2016/wordml/cid" xmlns:w16="http://schemas.microsoft.com/office/word/2018/wordml" xmlns:w16sdtdh="http://schemas.microsoft.com/office/word/2020/wordml/sdtdatahash" xmlns:w16se="http://schemas.microsoft.com/office/word/2015/wordml/symex" xmlns:wpg="http://schemas.microsoft.com/office/word/2010/wordprocessingGroup" xmlns:wpi="http://schemas.microsoft.com/office/word/2010/wordprocessingInk" xmlns:wne="http://schemas.microsoft.com/office/word/2006/wordml" xmlns:wps="http://schemas.microsoft.com/office/word/2010/wordprocessingShape" mc:Ignorable="w14 w15 w16se w16cid w16 w16cex w16sdtdh wp14">
   <w:body>
+    <w:bookmarkStart w:id="0" w:name="_Hlk110511240"/>
     <w:p>
       <w:pPr>
         <w:rPr>
@@ -11,7 +12,6 @@
           <w:szCs w:val="26"/>
         </w:rPr>
       </w:pPr>
-      <w:bookmarkStart w:id="0" w:name="_Hlk110511240"/>
       <w:r>
         <w:rPr>
           <w:rFonts w:ascii="Calibri Light" w:hAnsi="Calibri Light" w:cs="Calibri Light"/>
@@ -1967,13 +1967,7 @@
               <w:rPr>
                 <w:szCs w:val="26"/>
               </w:rPr>
-              <w:t>{</w:t>
-            </w:r>
-            <w:r>
-              <w:rPr>
-                <w:szCs w:val="26"/>
-              </w:rPr>
-              <w:t>_grado}</w:t>
+              <w:t>{_grado}</w:t>
             </w:r>
             <w:r>
               <w:rPr>
@@ -3650,56 +3644,26 @@
                 <w:sz w:val="26"/>
                 <w:szCs w:val="26"/>
               </w:rPr>
-              <w:t>{aplica/noAplica</w:t>
-            </w:r>
-            <w:r>
+              <w:t>{aplica/noAplica2}</w:t>
+            </w:r>
+          </w:p>
+        </w:tc>
+        <w:tc>
+          <w:tcPr>
+            <w:tcW w:w="2552" w:type="dxa"/>
+            <w:vAlign w:val="center"/>
+          </w:tcPr>
+          <w:p>
+            <w:pPr>
               <w:rPr>
                 <w:rFonts w:ascii="Trebuchet MS" w:hAnsi="Trebuchet MS"/>
-                <w:b/>
-                <w:sz w:val="26"/>
-                <w:szCs w:val="26"/>
-              </w:rPr>
-              <w:t>2</w:t>
-            </w:r>
+              </w:rPr>
+            </w:pPr>
             <w:r>
               <w:rPr>
                 <w:rFonts w:ascii="Trebuchet MS" w:hAnsi="Trebuchet MS"/>
-                <w:b/>
-                <w:sz w:val="26"/>
-                <w:szCs w:val="26"/>
-              </w:rPr>
-              <w:t>}</w:t>
-            </w:r>
-          </w:p>
-        </w:tc>
-        <w:tc>
-          <w:tcPr>
-            <w:tcW w:w="2552" w:type="dxa"/>
-            <w:vAlign w:val="center"/>
-          </w:tcPr>
-          <w:p>
-            <w:pPr>
-              <w:rPr>
-                <w:rFonts w:ascii="Trebuchet MS" w:hAnsi="Trebuchet MS"/>
-              </w:rPr>
-            </w:pPr>
-            <w:r>
-              <w:rPr>
-                <w:rFonts w:ascii="Trebuchet MS" w:hAnsi="Trebuchet MS"/>
-              </w:rPr>
-              <w:t>{numero_horas</w:t>
-            </w:r>
-            <w:r>
-              <w:rPr>
-                <w:rFonts w:ascii="Trebuchet MS" w:hAnsi="Trebuchet MS"/>
-              </w:rPr>
-              <w:t>2</w:t>
-            </w:r>
-            <w:r>
-              <w:rPr>
-                <w:rFonts w:ascii="Trebuchet MS" w:hAnsi="Trebuchet MS"/>
-              </w:rPr>
-              <w:t>}</w:t>
+              </w:rPr>
+              <w:t>{numero_horas2}</w:t>
             </w:r>
           </w:p>
         </w:tc>
@@ -3719,19 +3683,7 @@
               <w:rPr>
                 <w:rFonts w:ascii="Trebuchet MS" w:hAnsi="Trebuchet MS"/>
               </w:rPr>
-              <w:t>{exp_si</w:t>
-            </w:r>
-            <w:r>
-              <w:rPr>
-                <w:rFonts w:ascii="Trebuchet MS" w:hAnsi="Trebuchet MS"/>
-              </w:rPr>
-              <w:t>2</w:t>
-            </w:r>
-            <w:r>
-              <w:rPr>
-                <w:rFonts w:ascii="Trebuchet MS" w:hAnsi="Trebuchet MS"/>
-              </w:rPr>
-              <w:t>}</w:t>
+              <w:t>{exp_si2}</w:t>
             </w:r>
           </w:p>
         </w:tc>
@@ -3751,19 +3703,7 @@
               <w:rPr>
                 <w:rFonts w:ascii="Trebuchet MS" w:hAnsi="Trebuchet MS"/>
               </w:rPr>
-              <w:t>{exp_no</w:t>
-            </w:r>
-            <w:r>
-              <w:rPr>
-                <w:rFonts w:ascii="Trebuchet MS" w:hAnsi="Trebuchet MS"/>
-              </w:rPr>
-              <w:t>2</w:t>
-            </w:r>
-            <w:r>
-              <w:rPr>
-                <w:rFonts w:ascii="Trebuchet MS" w:hAnsi="Trebuchet MS"/>
-              </w:rPr>
-              <w:t>}</w:t>
+              <w:t>{exp_no2}</w:t>
             </w:r>
           </w:p>
         </w:tc>
@@ -3794,56 +3734,26 @@
                 <w:sz w:val="26"/>
                 <w:szCs w:val="26"/>
               </w:rPr>
-              <w:t>{aplica/noAplica</w:t>
-            </w:r>
-            <w:r>
+              <w:t>{aplica/noAplica3}</w:t>
+            </w:r>
+          </w:p>
+        </w:tc>
+        <w:tc>
+          <w:tcPr>
+            <w:tcW w:w="2552" w:type="dxa"/>
+            <w:vAlign w:val="center"/>
+          </w:tcPr>
+          <w:p>
+            <w:pPr>
               <w:rPr>
                 <w:rFonts w:ascii="Trebuchet MS" w:hAnsi="Trebuchet MS"/>
-                <w:b/>
-                <w:sz w:val="26"/>
-                <w:szCs w:val="26"/>
-              </w:rPr>
-              <w:t>3</w:t>
-            </w:r>
+              </w:rPr>
+            </w:pPr>
             <w:r>
               <w:rPr>
                 <w:rFonts w:ascii="Trebuchet MS" w:hAnsi="Trebuchet MS"/>
-                <w:b/>
-                <w:sz w:val="26"/>
-                <w:szCs w:val="26"/>
-              </w:rPr>
-              <w:t>}</w:t>
-            </w:r>
-          </w:p>
-        </w:tc>
-        <w:tc>
-          <w:tcPr>
-            <w:tcW w:w="2552" w:type="dxa"/>
-            <w:vAlign w:val="center"/>
-          </w:tcPr>
-          <w:p>
-            <w:pPr>
-              <w:rPr>
-                <w:rFonts w:ascii="Trebuchet MS" w:hAnsi="Trebuchet MS"/>
-              </w:rPr>
-            </w:pPr>
-            <w:r>
-              <w:rPr>
-                <w:rFonts w:ascii="Trebuchet MS" w:hAnsi="Trebuchet MS"/>
-              </w:rPr>
-              <w:t>{numero_horas</w:t>
-            </w:r>
-            <w:r>
-              <w:rPr>
-                <w:rFonts w:ascii="Trebuchet MS" w:hAnsi="Trebuchet MS"/>
-              </w:rPr>
-              <w:t>3</w:t>
-            </w:r>
-            <w:r>
-              <w:rPr>
-                <w:rFonts w:ascii="Trebuchet MS" w:hAnsi="Trebuchet MS"/>
-              </w:rPr>
-              <w:t>}</w:t>
+              </w:rPr>
+              <w:t>{numero_horas3}</w:t>
             </w:r>
           </w:p>
         </w:tc>
@@ -3863,19 +3773,7 @@
               <w:rPr>
                 <w:rFonts w:ascii="Trebuchet MS" w:hAnsi="Trebuchet MS"/>
               </w:rPr>
-              <w:t>{exp_si</w:t>
-            </w:r>
-            <w:r>
-              <w:rPr>
-                <w:rFonts w:ascii="Trebuchet MS" w:hAnsi="Trebuchet MS"/>
-              </w:rPr>
-              <w:t>3</w:t>
-            </w:r>
-            <w:r>
-              <w:rPr>
-                <w:rFonts w:ascii="Trebuchet MS" w:hAnsi="Trebuchet MS"/>
-              </w:rPr>
-              <w:t>}</w:t>
+              <w:t>{exp_si3}</w:t>
             </w:r>
           </w:p>
         </w:tc>
@@ -3895,19 +3793,7 @@
               <w:rPr>
                 <w:rFonts w:ascii="Trebuchet MS" w:hAnsi="Trebuchet MS"/>
               </w:rPr>
-              <w:t>{exp_no</w:t>
-            </w:r>
-            <w:r>
-              <w:rPr>
-                <w:rFonts w:ascii="Trebuchet MS" w:hAnsi="Trebuchet MS"/>
-              </w:rPr>
-              <w:t>3</w:t>
-            </w:r>
-            <w:r>
-              <w:rPr>
-                <w:rFonts w:ascii="Trebuchet MS" w:hAnsi="Trebuchet MS"/>
-              </w:rPr>
-              <w:t>}</w:t>
+              <w:t>{exp_no3}</w:t>
             </w:r>
           </w:p>
         </w:tc>
@@ -4564,7 +4450,6 @@
                 <w:lang w:val="es-CO"/>
               </w:rPr>
             </w:pPr>
-            <w:proofErr w:type="gramStart"/>
             <w:r>
               <w:rPr>
                 <w:rFonts w:asciiTheme="majorHAnsi" w:hAnsiTheme="majorHAnsi" w:cs="Arial"/>
@@ -4584,7 +4469,6 @@
               <w:t>{</w:t>
             </w:r>
             <w:proofErr w:type="spellStart"/>
-            <w:proofErr w:type="gramEnd"/>
             <w:r>
               <w:rPr>
                 <w:rFonts w:asciiTheme="majorHAnsi" w:hAnsiTheme="majorHAnsi" w:cs="Arial"/>
@@ -4769,7 +4653,6 @@
                 <w:lang w:val="es-CO"/>
               </w:rPr>
             </w:pPr>
-            <w:proofErr w:type="gramStart"/>
             <w:r>
               <w:rPr>
                 <w:rFonts w:asciiTheme="majorHAnsi" w:hAnsiTheme="majorHAnsi" w:cs="Arial"/>
@@ -4789,7 +4672,6 @@
               <w:t>{</w:t>
             </w:r>
             <w:proofErr w:type="spellStart"/>
-            <w:proofErr w:type="gramEnd"/>
             <w:r>
               <w:rPr>
                 <w:rFonts w:asciiTheme="majorHAnsi" w:hAnsiTheme="majorHAnsi" w:cs="Arial"/>
@@ -5630,7 +5512,6 @@
                 <w:lang w:val="es-CO"/>
               </w:rPr>
             </w:pPr>
-            <w:proofErr w:type="gramStart"/>
             <w:r>
               <w:rPr>
                 <w:rFonts w:asciiTheme="majorHAnsi" w:hAnsiTheme="majorHAnsi" w:cs="Arial"/>
@@ -5647,17 +5528,7 @@
                 <w:szCs w:val="26"/>
                 <w:lang w:val="es-CO"/>
               </w:rPr>
-              <w:t>{</w:t>
-            </w:r>
-            <w:proofErr w:type="gramEnd"/>
-            <w:r>
-              <w:rPr>
-                <w:rFonts w:asciiTheme="majorHAnsi" w:hAnsiTheme="majorHAnsi" w:cs="Arial"/>
-                <w:sz w:val="20"/>
-                <w:szCs w:val="26"/>
-                <w:lang w:val="es-CO"/>
-              </w:rPr>
-              <w:t>dia_inicio2}</w:t>
+              <w:t>{dia_inicio2}</w:t>
             </w:r>
             <w:r>
               <w:rPr>
@@ -5748,7 +5619,6 @@
                 <w:lang w:val="es-CO"/>
               </w:rPr>
             </w:pPr>
-            <w:proofErr w:type="gramStart"/>
             <w:r>
               <w:rPr>
                 <w:rFonts w:asciiTheme="majorHAnsi" w:hAnsiTheme="majorHAnsi" w:cs="Arial"/>
@@ -5765,17 +5635,7 @@
                 <w:szCs w:val="26"/>
                 <w:lang w:val="es-CO"/>
               </w:rPr>
-              <w:t>{</w:t>
-            </w:r>
-            <w:proofErr w:type="gramEnd"/>
-            <w:r>
-              <w:rPr>
-                <w:rFonts w:asciiTheme="majorHAnsi" w:hAnsiTheme="majorHAnsi" w:cs="Arial"/>
-                <w:sz w:val="20"/>
-                <w:szCs w:val="26"/>
-                <w:lang w:val="es-CO"/>
-              </w:rPr>
-              <w:t>dia_fin2}</w:t>
+              <w:t>{dia_fin2}</w:t>
             </w:r>
             <w:r>
               <w:rPr>
@@ -6479,7 +6339,6 @@
                 <w:lang w:val="es-CO"/>
               </w:rPr>
             </w:pPr>
-            <w:proofErr w:type="gramStart"/>
             <w:r>
               <w:rPr>
                 <w:rFonts w:asciiTheme="majorHAnsi" w:hAnsiTheme="majorHAnsi" w:cs="Arial"/>
@@ -6497,17 +6356,7 @@
                 <w:szCs w:val="26"/>
                 <w:lang w:val="es-CO"/>
               </w:rPr>
-              <w:t>{</w:t>
-            </w:r>
-            <w:proofErr w:type="gramEnd"/>
-            <w:r>
-              <w:rPr>
-                <w:rFonts w:asciiTheme="majorHAnsi" w:hAnsiTheme="majorHAnsi" w:cs="Arial"/>
-                <w:sz w:val="20"/>
-                <w:szCs w:val="26"/>
-                <w:lang w:val="es-CO"/>
-              </w:rPr>
-              <w:t>dia_inicio3}</w:t>
+              <w:t>{dia_inicio3}</w:t>
             </w:r>
             <w:r>
               <w:rPr>
@@ -6599,7 +6448,6 @@
                 <w:lang w:val="es-CO"/>
               </w:rPr>
             </w:pPr>
-            <w:proofErr w:type="gramStart"/>
             <w:r>
               <w:rPr>
                 <w:rFonts w:asciiTheme="majorHAnsi" w:hAnsiTheme="majorHAnsi" w:cs="Arial"/>
@@ -6617,17 +6465,7 @@
                 <w:szCs w:val="26"/>
                 <w:lang w:val="es-CO"/>
               </w:rPr>
-              <w:t>{</w:t>
-            </w:r>
-            <w:proofErr w:type="gramEnd"/>
-            <w:r>
-              <w:rPr>
-                <w:rFonts w:asciiTheme="majorHAnsi" w:hAnsiTheme="majorHAnsi" w:cs="Arial"/>
-                <w:sz w:val="20"/>
-                <w:szCs w:val="26"/>
-                <w:lang w:val="es-CO"/>
-              </w:rPr>
-              <w:t>dia_fin3}</w:t>
+              <w:t>{dia_fin3}</w:t>
             </w:r>
             <w:r>
               <w:rPr>
@@ -12249,6 +12087,12 @@
                               </w:rPr>
                               <w:t>{</w:t>
                             </w:r>
+                            <w:r>
+                              <w:rPr>
+                                <w:lang w:val="es-AR"/>
+                              </w:rPr>
+                              <w:t>%</w:t>
+                            </w:r>
                             <w:proofErr w:type="spellStart"/>
                             <w:r>
                               <w:rPr>
@@ -12286,7 +12130,11 @@
           </mc:Choice>
           <mc:Fallback>
             <w:pict>
-              <v:shape w14:anchorId="67888A26" id="Cuadro de texto 4" o:spid="_x0000_s1031" type="#_x0000_t202" style="position:absolute;margin-left:18.6pt;margin-top:59.7pt;width:179.15pt;height:32.25pt;z-index:251702784;visibility:visible;mso-wrap-style:square;mso-width-percent:0;mso-height-percent:0;mso-wrap-distance-left:9pt;mso-wrap-distance-top:0;mso-wrap-distance-right:9pt;mso-wrap-distance-bottom:0;mso-position-horizontal:absolute;mso-position-horizontal-relative:text;mso-position-vertical:absolute;mso-position-vertical-relative:text;mso-width-percent:0;mso-height-percent:0;mso-width-relative:margin;mso-height-relative:margin;v-text-anchor:top" o:gfxdata="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" fillcolor="white [3201]" stroked="f" strokeweight=".5pt">
+              <v:shapetype w14:anchorId="67888A26" id="_x0000_t202" coordsize="21600,21600" o:spt="202" path="m,l,21600r21600,l21600,xe">
+                <v:stroke joinstyle="miter"/>
+                <v:path gradientshapeok="t" o:connecttype="rect"/>
+              </v:shapetype>
+              <v:shape id="Cuadro de texto 4" o:spid="_x0000_s1031" type="#_x0000_t202" style="position:absolute;margin-left:18.6pt;margin-top:59.7pt;width:179.15pt;height:32.25pt;z-index:251702784;visibility:visible;mso-wrap-style:square;mso-width-percent:0;mso-height-percent:0;mso-wrap-distance-left:9pt;mso-wrap-distance-top:0;mso-wrap-distance-right:9pt;mso-wrap-distance-bottom:0;mso-position-horizontal:absolute;mso-position-horizontal-relative:text;mso-position-vertical:absolute;mso-position-vertical-relative:text;mso-width-percent:0;mso-height-percent:0;mso-width-relative:margin;mso-height-relative:margin;v-text-anchor:top" o:gfxdata="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" fillcolor="white [3201]" stroked="f" strokeweight=".5pt">
                 <v:textbox>
                   <w:txbxContent>
                     <w:p>
@@ -12300,6 +12148,12 @@
                           <w:lang w:val="es-AR"/>
                         </w:rPr>
                         <w:t>{</w:t>
+                      </w:r>
+                      <w:r>
+                        <w:rPr>
+                          <w:lang w:val="es-AR"/>
+                        </w:rPr>
+                        <w:t>%</w:t>
                       </w:r>
                       <w:proofErr w:type="spellStart"/>
                       <w:r>
@@ -13021,7 +12875,7 @@
                       <a:effectLst/>
                       <a:extLst>
                         <a:ext uri="{C572A759-6A51-4108-AA02-DFA0A04FC94B}">
-                          <ma14:wrappingTextBoxFlag xmlns:ma14="http://schemas.microsoft.com/office/mac/drawingml/2011/main" xmlns:w="http://schemas.openxmlformats.org/wordprocessingml/2006/main" xmlns:w10="urn:schemas-microsoft-com:office:word" xmlns:v="urn:schemas-microsoft-com:vml" xmlns:o="urn:schemas-microsoft-com:office:office" xmlns:mv="urn:schemas-microsoft-com:mac:vml" xmlns:mo="http://schemas.microsoft.com/office/mac/office/2008/main" xmlns="" xmlns:arto="http://schemas.microsoft.com/office/word/2006/arto"/>
+                          <ma14:wrappingTextBoxFlag xmlns:arto="http://schemas.microsoft.com/office/word/2006/arto" xmlns="" xmlns:mo="http://schemas.microsoft.com/office/mac/office/2008/main" xmlns:mv="urn:schemas-microsoft-com:mac:vml" xmlns:o="urn:schemas-microsoft-com:office:office" xmlns:v="urn:schemas-microsoft-com:vml" xmlns:w10="urn:schemas-microsoft-com:office:word" xmlns:w="http://schemas.openxmlformats.org/wordprocessingml/2006/main" xmlns:ma14="http://schemas.microsoft.com/office/mac/drawingml/2011/main"/>
                         </a:ext>
                       </a:extLst>
                     </wps:spPr>

</xml_diff>

<commit_message>
chore: sincronización de plantilla de Word con tags robustos alfanuméricos
</commit_message>
<xml_diff>
--- a/src/features/fundacion/docs/FORMATO HOJA DE VIDA FHISYL.docx
+++ b/src/features/fundacion/docs/FORMATO HOJA DE VIDA FHISYL.docx
@@ -68,7 +68,13 @@
                         <w:txbxContent>
                           <w:p>
                             <w:r>
-                              <w:t>{%foto_perfil}</w:t>
+                              <w:t>{%</w:t>
+                            </w:r>
+                            <w:r>
+                              <w:t>fotoUser</w:t>
+                            </w:r>
+                            <w:r>
+                              <w:t>}</w:t>
                             </w:r>
                           </w:p>
                         </w:txbxContent>
@@ -99,7 +105,13 @@
                   <w:txbxContent>
                     <w:p>
                       <w:r>
-                        <w:t>{%foto_perfil}</w:t>
+                        <w:t>{%</w:t>
+                      </w:r>
+                      <w:r>
+                        <w:t>fotoUser</w:t>
+                      </w:r>
+                      <w:r>
+                        <w:t>}</w:t>
                       </w:r>
                     </w:p>
                   </w:txbxContent>
@@ -176,19 +188,16 @@
                               <w:rPr>
                                 <w:lang w:val="es-CO"/>
                               </w:rPr>
-                              <w:t>{descripci</w:t>
+                              <w:t>{</w:t>
+                            </w:r>
+                            <w:r>
+                              <w:t>descripMain</w:t>
                             </w:r>
                             <w:r>
                               <w:rPr>
                                 <w:lang w:val="es-CO"/>
                               </w:rPr>
-                              <w:t>o</w:t>
-                            </w:r>
-                            <w:r>
-                              <w:rPr>
-                                <w:lang w:val="es-CO"/>
-                              </w:rPr>
-                              <w:t>nMinisterioProfesion}</w:t>
+                              <w:t>}</w:t>
                             </w:r>
                           </w:p>
                         </w:txbxContent>
@@ -224,19 +233,16 @@
                         <w:rPr>
                           <w:lang w:val="es-CO"/>
                         </w:rPr>
-                        <w:t>{descripci</w:t>
+                        <w:t>{</w:t>
+                      </w:r>
+                      <w:r>
+                        <w:t>descripMain</w:t>
                       </w:r>
                       <w:r>
                         <w:rPr>
                           <w:lang w:val="es-CO"/>
                         </w:rPr>
-                        <w:t>o</w:t>
-                      </w:r>
-                      <w:r>
-                        <w:rPr>
-                          <w:lang w:val="es-CO"/>
-                        </w:rPr>
-                        <w:t>nMinisterioProfesion}</w:t>
+                        <w:t>}</w:t>
                       </w:r>
                     </w:p>
                   </w:txbxContent>
@@ -1841,13 +1847,13 @@
               <w:rPr>
                 <w:szCs w:val="26"/>
               </w:rPr>
-              <w:t>1</w:t>
-            </w:r>
-            <w:r>
-              <w:rPr>
-                <w:szCs w:val="26"/>
-              </w:rPr>
-              <w:t>_grado}</w:t>
+              <w:t>grado1</w:t>
+            </w:r>
+            <w:r>
+              <w:rPr>
+                <w:szCs w:val="26"/>
+              </w:rPr>
+              <w:t>}</w:t>
             </w:r>
           </w:p>
         </w:tc>
@@ -1873,13 +1879,13 @@
               <w:rPr>
                 <w:szCs w:val="26"/>
               </w:rPr>
-              <w:t>2</w:t>
-            </w:r>
-            <w:r>
-              <w:rPr>
-                <w:szCs w:val="26"/>
-              </w:rPr>
-              <w:t>_grado}</w:t>
+              <w:t>grado2</w:t>
+            </w:r>
+            <w:r>
+              <w:rPr>
+                <w:szCs w:val="26"/>
+              </w:rPr>
+              <w:t>}</w:t>
             </w:r>
           </w:p>
         </w:tc>
@@ -1906,13 +1912,19 @@
               <w:rPr>
                 <w:szCs w:val="26"/>
               </w:rPr>
-              <w:t>3</w:t>
-            </w:r>
-            <w:r>
-              <w:rPr>
-                <w:szCs w:val="26"/>
-              </w:rPr>
-              <w:t>_grado}</w:t>
+              <w:t>grado</w:t>
+            </w:r>
+            <w:r>
+              <w:rPr>
+                <w:szCs w:val="26"/>
+              </w:rPr>
+              <w:t xml:space="preserve"> 3</w:t>
+            </w:r>
+            <w:r>
+              <w:rPr>
+                <w:szCs w:val="26"/>
+              </w:rPr>
+              <w:t>}</w:t>
             </w:r>
           </w:p>
         </w:tc>
@@ -1933,13 +1945,19 @@
               <w:rPr>
                 <w:szCs w:val="26"/>
               </w:rPr>
-              <w:t>{_grado}</w:t>
-            </w:r>
-            <w:r>
-              <w:rPr>
-                <w:szCs w:val="26"/>
-              </w:rPr>
-              <w:t>4</w:t>
+              <w:t>{</w:t>
+            </w:r>
+            <w:r>
+              <w:rPr>
+                <w:szCs w:val="26"/>
+              </w:rPr>
+              <w:t>grad</w:t>
+            </w:r>
+            <w:r>
+              <w:rPr>
+                <w:szCs w:val="26"/>
+              </w:rPr>
+              <w:t>o4</w:t>
             </w:r>
             <w:r>
               <w:rPr>
@@ -1971,13 +1989,19 @@
               <w:rPr>
                 <w:szCs w:val="26"/>
               </w:rPr>
-              <w:t>5</w:t>
-            </w:r>
-            <w:r>
-              <w:rPr>
-                <w:szCs w:val="26"/>
-              </w:rPr>
-              <w:t>_grado}</w:t>
+              <w:t>grad</w:t>
+            </w:r>
+            <w:r>
+              <w:rPr>
+                <w:szCs w:val="26"/>
+              </w:rPr>
+              <w:t>o5</w:t>
+            </w:r>
+            <w:r>
+              <w:rPr>
+                <w:szCs w:val="26"/>
+              </w:rPr>
+              <w:t>}</w:t>
             </w:r>
           </w:p>
         </w:tc>
@@ -1996,7 +2020,7 @@
               <w:rPr>
                 <w:szCs w:val="26"/>
               </w:rPr>
-              <w:t>{</w:t>
+              <w:t>{grado</w:t>
             </w:r>
             <w:r>
               <w:rPr>
@@ -2008,7 +2032,7 @@
               <w:rPr>
                 <w:szCs w:val="26"/>
               </w:rPr>
-              <w:t>_grado}</w:t>
+              <w:t>}</w:t>
             </w:r>
           </w:p>
         </w:tc>
@@ -2027,7 +2051,7 @@
               <w:rPr>
                 <w:szCs w:val="26"/>
               </w:rPr>
-              <w:t>{</w:t>
+              <w:t>{grado</w:t>
             </w:r>
             <w:r>
               <w:rPr>
@@ -2039,7 +2063,7 @@
               <w:rPr>
                 <w:szCs w:val="26"/>
               </w:rPr>
-              <w:t>_grado}</w:t>
+              <w:t>}</w:t>
             </w:r>
           </w:p>
         </w:tc>
@@ -2059,7 +2083,7 @@
               <w:rPr>
                 <w:szCs w:val="26"/>
               </w:rPr>
-              <w:t>{</w:t>
+              <w:t>{grado</w:t>
             </w:r>
             <w:r>
               <w:rPr>
@@ -2071,7 +2095,7 @@
               <w:rPr>
                 <w:szCs w:val="26"/>
               </w:rPr>
-              <w:t>_grado}</w:t>
+              <w:t>}</w:t>
             </w:r>
           </w:p>
         </w:tc>
@@ -2090,7 +2114,7 @@
               <w:rPr>
                 <w:szCs w:val="26"/>
               </w:rPr>
-              <w:t>{</w:t>
+              <w:t>{grado</w:t>
             </w:r>
             <w:r>
               <w:rPr>
@@ -2102,7 +2126,7 @@
               <w:rPr>
                 <w:szCs w:val="26"/>
               </w:rPr>
-              <w:t>_grado}</w:t>
+              <w:t>}</w:t>
             </w:r>
           </w:p>
         </w:tc>
@@ -2123,7 +2147,7 @@
               <w:rPr>
                 <w:szCs w:val="26"/>
               </w:rPr>
-              <w:t>{</w:t>
+              <w:t>{grado</w:t>
             </w:r>
             <w:r>
               <w:rPr>
@@ -2135,7 +2159,7 @@
               <w:rPr>
                 <w:szCs w:val="26"/>
               </w:rPr>
-              <w:t>_grado}</w:t>
+              <w:t>}</w:t>
             </w:r>
           </w:p>
         </w:tc>
@@ -2157,7 +2181,7 @@
               <w:rPr>
                 <w:szCs w:val="26"/>
               </w:rPr>
-              <w:t>{</w:t>
+              <w:t>{grado</w:t>
             </w:r>
             <w:r>
               <w:rPr>
@@ -2169,7 +2193,7 @@
               <w:rPr>
                 <w:szCs w:val="26"/>
               </w:rPr>
-              <w:t>_grado}</w:t>
+              <w:t>}</w:t>
             </w:r>
           </w:p>
         </w:tc>
@@ -2705,7 +2729,6 @@
                 <w:szCs w:val="28"/>
                 <w:lang w:val="es-CO"/>
               </w:rPr>
-              <w:lastRenderedPageBreak/>
               <w:t>{numero_aprobado_1}</w:t>
             </w:r>
           </w:p>
@@ -2816,6 +2839,7 @@
                 <w:szCs w:val="28"/>
                 <w:lang w:val="es-CO"/>
               </w:rPr>
+              <w:lastRenderedPageBreak/>
               <w:t>{numero_aprobado_</w:t>
             </w:r>
             <w:r>
@@ -11279,10 +11303,13 @@
                               <w:t>%</w:t>
                             </w:r>
                             <w:r>
+                              <w:t>firmaUser</w:t>
+                            </w:r>
+                            <w:r>
                               <w:rPr>
                                 <w:lang w:val="es-AR"/>
                               </w:rPr>
-                              <w:t>firma_digital}</w:t>
+                              <w:t>}</w:t>
                             </w:r>
                           </w:p>
                         </w:txbxContent>
@@ -11329,10 +11356,13 @@
                         <w:t>%</w:t>
                       </w:r>
                       <w:r>
+                        <w:t>firmaUser</w:t>
+                      </w:r>
+                      <w:r>
                         <w:rPr>
                           <w:lang w:val="es-AR"/>
                         </w:rPr>
-                        <w:t>firma_digital}</w:t>
+                        <w:t>}</w:t>
                       </w:r>
                     </w:p>
                   </w:txbxContent>
@@ -11580,9 +11610,20 @@
                           <w:r>
                             <w:rPr>
                               <w:rFonts w:ascii="Lucida Calligraphy" w:hAnsi="Lucida Calligraphy" w:cs="Segoe UI"/>
-                              <w:lang w:val="es-CO"/>
                             </w:rPr>
-                            <w:t>{frase_identificadora}</w:t>
+                            <w:t>{</w:t>
+                          </w:r>
+                          <w:r>
+                            <w:rPr>
+                              <w:rFonts w:ascii="Lucida Calligraphy" w:hAnsi="Lucida Calligraphy" w:cs="Segoe UI"/>
+                            </w:rPr>
+                            <w:t>fraseUser</w:t>
+                          </w:r>
+                          <w:r>
+                            <w:rPr>
+                              <w:rFonts w:ascii="Lucida Calligraphy" w:hAnsi="Lucida Calligraphy" w:cs="Segoe UI"/>
+                            </w:rPr>
+                            <w:t>}</w:t>
                           </w:r>
                         </w:p>
                       </w:txbxContent>
@@ -11621,9 +11662,20 @@
                     <w:r>
                       <w:rPr>
                         <w:rFonts w:ascii="Lucida Calligraphy" w:hAnsi="Lucida Calligraphy" w:cs="Segoe UI"/>
-                        <w:lang w:val="es-CO"/>
                       </w:rPr>
-                      <w:t>{frase_identificadora}</w:t>
+                      <w:t>{</w:t>
+                    </w:r>
+                    <w:r>
+                      <w:rPr>
+                        <w:rFonts w:ascii="Lucida Calligraphy" w:hAnsi="Lucida Calligraphy" w:cs="Segoe UI"/>
+                      </w:rPr>
+                      <w:t>fraseUser</w:t>
+                    </w:r>
+                    <w:r>
+                      <w:rPr>
+                        <w:rFonts w:ascii="Lucida Calligraphy" w:hAnsi="Lucida Calligraphy" w:cs="Segoe UI"/>
+                      </w:rPr>
+                      <w:t>}</w:t>
                     </w:r>
                   </w:p>
                 </w:txbxContent>
@@ -11968,7 +12020,7 @@
                       <a:effectLst/>
                       <a:extLst>
                         <a:ext uri="{C572A759-6A51-4108-AA02-DFA0A04FC94B}">
-                          <ma14:wrappingTextBoxFlag xmlns:arto="http://schemas.microsoft.com/office/word/2006/arto" xmlns="" xmlns:mo="http://schemas.microsoft.com/office/mac/office/2008/main" xmlns:mv="urn:schemas-microsoft-com:mac:vml" xmlns:o="urn:schemas-microsoft-com:office:office" xmlns:v="urn:schemas-microsoft-com:vml" xmlns:w10="urn:schemas-microsoft-com:office:word" xmlns:w="http://schemas.openxmlformats.org/wordprocessingml/2006/main" xmlns:ma14="http://schemas.microsoft.com/office/mac/drawingml/2011/main"/>
+                          <ma14:wrappingTextBoxFlag xmlns:ma14="http://schemas.microsoft.com/office/mac/drawingml/2011/main" xmlns:w="http://schemas.openxmlformats.org/wordprocessingml/2006/main" xmlns:w10="urn:schemas-microsoft-com:office:word" xmlns:v="urn:schemas-microsoft-com:vml" xmlns:o="urn:schemas-microsoft-com:office:office" xmlns:mv="urn:schemas-microsoft-com:mac:vml" xmlns:mo="http://schemas.microsoft.com/office/mac/office/2008/main" xmlns="" xmlns:arto="http://schemas.microsoft.com/office/word/2006/arto"/>
                         </a:ext>
                       </a:extLst>
                     </wps:spPr>
@@ -12688,7 +12740,6 @@
   <w:style w:type="character" w:default="1" w:styleId="Fuentedeprrafopredeter">
     <w:name w:val="Default Paragraph Font"/>
     <w:uiPriority w:val="1"/>
-    <w:semiHidden/>
     <w:unhideWhenUsed/>
   </w:style>
   <w:style w:type="table" w:default="1" w:styleId="Tablanormal">

</xml_diff>